<commit_message>
Expand ontology platform storage architecture
Co-authored-by: zhixia1993 <zhixia1993@users.noreply.github.com>
</commit_message>
<xml_diff>
--- a/ONTOLOGY_PLATFORM_ARCHITECTURE_DESIGN.docx
+++ b/ONTOLOGY_PLATFORM_ARCHITECTURE_DESIGN.docx
@@ -201,31 +201,55 @@
         <w:ind w:left="360" w:hanging="240"/>
       </w:pPr>
       <w:r>
-        <w:t xml:space="preserve">• 业务库：保存用户、权限、数据源配置、任务、草稿、审批、广场资产、问答应用配置等平台元数据。</w:t>
-      </w:r>
-    </w:p>
-    <w:p>
-      <w:pPr>
-        <w:ind w:left="360" w:hanging="240"/>
-      </w:pPr>
-      <w:r>
-        <w:t xml:space="preserve">• Jena/Fuseki：保存已发布本体模型、实例数据、标注相关 RDF 数据和推理结果。</w:t>
-      </w:r>
-    </w:p>
-    <w:p>
-      <w:pPr>
-        <w:ind w:left="360" w:hanging="240"/>
-      </w:pPr>
-      <w:r>
-        <w:t xml:space="preserve">• 对象存储：保存原始文件、解析产物、导入包、工具配置包和附件。</w:t>
-      </w:r>
-    </w:p>
-    <w:p>
-      <w:pPr>
-        <w:ind w:left="360" w:hanging="240"/>
-      </w:pPr>
-      <w:r>
-        <w:t xml:space="preserve">• 任务队列：承载元数据探查、文件解析、自动建模、模型发布、推理预计算等异步任务。</w:t>
+        <w:t xml:space="preserve">• 业务关系库：建议 PostgreSQL 优先，也可使用 MySQL，保存用户、权限、数据源配置、任务、草稿、审批、广场资产、问答应用配置等平台元数据。</w:t>
+      </w:r>
+    </w:p>
+    <w:p>
+      <w:pPr>
+        <w:ind w:left="360" w:hanging="240"/>
+      </w:pPr>
+      <w:r>
+        <w:t xml:space="preserve">• Jena/Fuseki：保存已发布本体模型、实例数据、标注相关 RDF 数据和推理结果。Jena 是本体/RDF 仓库，不承担平台业务数据主库职责。</w:t>
+      </w:r>
+    </w:p>
+    <w:p>
+      <w:pPr>
+        <w:ind w:left="360" w:hanging="240"/>
+      </w:pPr>
+      <w:r>
+        <w:t xml:space="preserve">• 对象存储：建议 MinIO、S3 或兼容对象存储，保存原始文件、解析产物、导入包、工具配置包和附件。</w:t>
+      </w:r>
+    </w:p>
+    <w:p>
+      <w:pPr>
+        <w:ind w:left="360" w:hanging="240"/>
+      </w:pPr>
+      <w:r>
+        <w:t xml:space="preserve">• 检索与向量库：建议 OpenSearch/Elasticsearch 承载全文检索，Milvus、pgvector 或 Elasticsearch Vector 承载向量检索，用于非结构化问答和证据召回。</w:t>
+      </w:r>
+    </w:p>
+    <w:p>
+      <w:pPr>
+        <w:ind w:left="360" w:hanging="240"/>
+      </w:pPr>
+      <w:r>
+        <w:t xml:space="preserve">• 缓存：建议 Redis 缓存会话、任务进度、短期查询结果、登录态和限流计数。</w:t>
+      </w:r>
+    </w:p>
+    <w:p>
+      <w:pPr>
+        <w:ind w:left="360" w:hanging="240"/>
+      </w:pPr>
+      <w:r>
+        <w:t xml:space="preserve">• 任务队列：建议 RabbitMQ、Kafka、Redis Stream 或 Celery/RQ，承载元数据探查、文件解析、自动建模、模型发布、推理预计算等异步任务。</w:t>
+      </w:r>
+    </w:p>
+    <w:p>
+      <w:pPr>
+        <w:ind w:left="360" w:hanging="240"/>
+      </w:pPr>
+      <w:r>
+        <w:t xml:space="preserve">• 日志与监控：建议 Prometheus/Grafana 监控服务指标，OpenTelemetry 收集链路追踪，集中日志系统保存运行日志和错误日志。</w:t>
       </w:r>
     </w:p>
     <w:p>
@@ -481,6 +505,246 @@
     </w:p>
     <w:p>
       <w:pPr>
+        <w:pStyle w:val="Heading2"/>
+      </w:pPr>
+      <w:r>
+        <w:t xml:space="preserve">2.4 完整存储与中间件架构</w:t>
+      </w:r>
+    </w:p>
+    <w:p>
+      <w:r>
+        <w:t xml:space="preserve"/>
+      </w:r>
+    </w:p>
+    <w:p>
+      <w:r>
+        <w:t xml:space="preserve">Jena 只解决本体模型、RDF 三元组、实例关系和推理结果的存储查询问题。完整平台至少需要以下存储与中间件共同支撑：</w:t>
+      </w:r>
+    </w:p>
+    <w:p>
+      <w:r>
+        <w:t xml:space="preserve"/>
+      </w:r>
+    </w:p>
+    <w:p>
+      <w:pPr>
+        <w:pStyle w:val="Code"/>
+      </w:pPr>
+      <w:r>
+        <w:rPr>
+          <w:rFonts w:ascii="Consolas" w:eastAsia="Microsoft YaHei"/>
+          <w:sz w:val="20"/>
+        </w:rPr>
+        <w:t xml:space="preserve">类型    推荐组件    保存内容    说明</w:t>
+      </w:r>
+    </w:p>
+    <w:p>
+      <w:pPr>
+        <w:pStyle w:val="Code"/>
+      </w:pPr>
+      <w:r>
+        <w:rPr>
+          <w:rFonts w:ascii="Consolas" w:eastAsia="Microsoft YaHei"/>
+          <w:sz w:val="20"/>
+        </w:rPr>
+        <w:t xml:space="preserve">业务关系库    PostgreSQL / MySQL    用户、角色、权限、数据源、任务、草稿、审批、模型版本、广场资产、应用配置    平台主数据库，强事务、强一致</w:t>
+      </w:r>
+    </w:p>
+    <w:p>
+      <w:pPr>
+        <w:pStyle w:val="Code"/>
+      </w:pPr>
+      <w:r>
+        <w:rPr>
+          <w:rFonts w:ascii="Consolas" w:eastAsia="Microsoft YaHei"/>
+          <w:sz w:val="20"/>
+        </w:rPr>
+        <w:t xml:space="preserve">Jena 模型仓库    Apache Jena Fuseki    本体 schema、实例三元组、标注 RDF、推理结果    RDF 和本体推理核心仓库</w:t>
+      </w:r>
+    </w:p>
+    <w:p>
+      <w:pPr>
+        <w:pStyle w:val="Code"/>
+      </w:pPr>
+      <w:r>
+        <w:rPr>
+          <w:rFonts w:ascii="Consolas" w:eastAsia="Microsoft YaHei"/>
+          <w:sz w:val="20"/>
+        </w:rPr>
+        <w:t xml:space="preserve">对象存储    MinIO / S3    原始文件、解析产物、导出文件、工具包、附件    文件和大对象统一存储</w:t>
+      </w:r>
+    </w:p>
+    <w:p>
+      <w:pPr>
+        <w:pStyle w:val="Code"/>
+      </w:pPr>
+      <w:r>
+        <w:rPr>
+          <w:rFonts w:ascii="Consolas" w:eastAsia="Microsoft YaHei"/>
+          <w:sz w:val="20"/>
+        </w:rPr>
+        <w:t xml:space="preserve">全文检索    OpenSearch / Elasticsearch    文档分块、解析文本、字段说明、资产搜索索引    支持关键词检索、证据召回</w:t>
+      </w:r>
+    </w:p>
+    <w:p>
+      <w:pPr>
+        <w:pStyle w:val="Code"/>
+      </w:pPr>
+      <w:r>
+        <w:rPr>
+          <w:rFonts w:ascii="Consolas" w:eastAsia="Microsoft YaHei"/>
+          <w:sz w:val="20"/>
+        </w:rPr>
+        <w:t xml:space="preserve">向量检索    Milvus / pgvector / ES Vector    文档向量、概念向量、问答语义召回向量    支持语义检索和 RAG</w:t>
+      </w:r>
+    </w:p>
+    <w:p>
+      <w:pPr>
+        <w:pStyle w:val="Code"/>
+      </w:pPr>
+      <w:r>
+        <w:rPr>
+          <w:rFonts w:ascii="Consolas" w:eastAsia="Microsoft YaHei"/>
+          <w:sz w:val="20"/>
+        </w:rPr>
+        <w:t xml:space="preserve">缓存    Redis    登录态、任务进度、热点模型摘要、限流计数    提升响应速度，降低数据库压力</w:t>
+      </w:r>
+    </w:p>
+    <w:p>
+      <w:pPr>
+        <w:pStyle w:val="Code"/>
+      </w:pPr>
+      <w:r>
+        <w:rPr>
+          <w:rFonts w:ascii="Consolas" w:eastAsia="Microsoft YaHei"/>
+          <w:sz w:val="20"/>
+        </w:rPr>
+        <w:t xml:space="preserve">消息队列    RabbitMQ / Kafka / Redis Stream    探查任务、解析任务、建模任务、发布任务、推理任务    异步化和削峰填谷</w:t>
+      </w:r>
+    </w:p>
+    <w:p>
+      <w:pPr>
+        <w:pStyle w:val="Code"/>
+      </w:pPr>
+      <w:r>
+        <w:rPr>
+          <w:rFonts w:ascii="Consolas" w:eastAsia="Microsoft YaHei"/>
+          <w:sz w:val="20"/>
+        </w:rPr>
+        <w:t xml:space="preserve">审计与日志    业务库 + 日志系统    操作审计、接口调用、错误日志、运行日志    安全追溯和问题定位</w:t>
+      </w:r>
+    </w:p>
+    <w:p>
+      <w:pPr>
+        <w:pStyle w:val="Code"/>
+      </w:pPr>
+      <w:r>
+        <w:rPr>
+          <w:rFonts w:ascii="Consolas" w:eastAsia="Microsoft YaHei"/>
+          <w:sz w:val="20"/>
+        </w:rPr>
+        <w:t xml:space="preserve">配置与密钥    Vault / KMS / 加密表    数据源密码、第三方密钥、SSO 密钥    敏感配置加密和轮换</w:t>
+      </w:r>
+    </w:p>
+    <w:p>
+      <w:r>
+        <w:t xml:space="preserve"/>
+      </w:r>
+    </w:p>
+    <w:p>
+      <w:pPr>
+        <w:pStyle w:val="Heading2"/>
+      </w:pPr>
+      <w:r>
+        <w:t xml:space="preserve">2.5 前后端完整性补充</w:t>
+      </w:r>
+    </w:p>
+    <w:p>
+      <w:r>
+        <w:t xml:space="preserve"/>
+      </w:r>
+    </w:p>
+    <w:p>
+      <w:r>
+        <w:t xml:space="preserve">除功能页面和接口外，研发还必须覆盖以下横切能力：</w:t>
+      </w:r>
+    </w:p>
+    <w:p>
+      <w:r>
+        <w:t xml:space="preserve"/>
+      </w:r>
+    </w:p>
+    <w:p>
+      <w:pPr>
+        <w:ind w:left="360" w:hanging="240"/>
+      </w:pPr>
+      <w:r>
+        <w:t xml:space="preserve">• API 契约：统一响应格式、错误码、分页格式、异步任务状态格式、文件上传协议。</w:t>
+      </w:r>
+    </w:p>
+    <w:p>
+      <w:pPr>
+        <w:ind w:left="360" w:hanging="240"/>
+      </w:pPr>
+      <w:r>
+        <w:t xml:space="preserve">• 权限模型：菜单权限、按钮权限、数据源权限、模型权限、广场资产权限、应用调用权限。</w:t>
+      </w:r>
+    </w:p>
+    <w:p>
+      <w:pPr>
+        <w:ind w:left="360" w:hanging="240"/>
+      </w:pPr>
+      <w:r>
+        <w:t xml:space="preserve">• 多租户/工作空间：如果面向多团队使用，需增加 workspace_id 或 tenant_id 隔离。</w:t>
+      </w:r>
+    </w:p>
+    <w:p>
+      <w:pPr>
+        <w:ind w:left="360" w:hanging="240"/>
+      </w:pPr>
+      <w:r>
+        <w:t xml:space="preserve">• 异步任务：所有耗时操作必须任务化，包括元数据探查、文件解析、自动建模、模型发布、推理预计算、资产审核。</w:t>
+      </w:r>
+    </w:p>
+    <w:p>
+      <w:pPr>
+        <w:ind w:left="360" w:hanging="240"/>
+      </w:pPr>
+      <w:r>
+        <w:t xml:space="preserve">• 可观测性：接口耗时、任务耗时、队列堆积、Jena 查询耗时、向量检索耗时、模型问答成功率。</w:t>
+      </w:r>
+    </w:p>
+    <w:p>
+      <w:pPr>
+        <w:ind w:left="360" w:hanging="240"/>
+      </w:pPr>
+      <w:r>
+        <w:t xml:space="preserve">• 数据安全：数据源凭证加密、字段脱敏、查询接口只读、安全审计、下载权限控制。</w:t>
+      </w:r>
+    </w:p>
+    <w:p>
+      <w:pPr>
+        <w:ind w:left="360" w:hanging="240"/>
+      </w:pPr>
+      <w:r>
+        <w:t xml:space="preserve">• 前端体验：空状态、加载态、错误态、重试、任务进度、权限不可见、长列表分页、搜索筛选。</w:t>
+      </w:r>
+    </w:p>
+    <w:p>
+      <w:pPr>
+        <w:ind w:left="360" w:hanging="240"/>
+      </w:pPr>
+      <w:r>
+        <w:t xml:space="preserve">• 测试体系：单元测试、接口测试、连接器集成测试、解析回归测试、Jena 查询推理测试、端到端页面测试。</w:t>
+      </w:r>
+    </w:p>
+    <w:p>
+      <w:r>
+        <w:t xml:space="preserve"/>
+      </w:r>
+    </w:p>
+    <w:p>
+      <w:pPr>
         <w:pStyle w:val="Heading1"/>
       </w:pPr>
       <w:r>
@@ -817,6 +1081,14 @@
       </w:r>
     </w:p>
     <w:p>
+      <w:pPr>
+        <w:ind w:left="360" w:hanging="240"/>
+      </w:pPr>
+      <w:r>
+        <w:t xml:space="preserve">• 存储落点：数据源配置、元数据和查询接口定义入业务关系库；连接凭证入加密凭证表或密钥系统；查询审计入审计表；高频元数据摘要可缓存到 Redis。</w:t>
+      </w:r>
+    </w:p>
+    <w:p>
       <w:r>
         <w:t xml:space="preserve"/>
       </w:r>
@@ -1206,6 +1478,14 @@
       </w:r>
     </w:p>
     <w:p>
+      <w:pPr>
+        <w:ind w:left="360" w:hanging="240"/>
+      </w:pPr>
+      <w:r>
+        <w:t xml:space="preserve">• 检索落点：文档分块和关键词索引入 OpenSearch/Elasticsearch；语义向量入 Milvus、pgvector 或其他向量库；分块元数据、证据位置和解析状态入业务关系库。</w:t>
+      </w:r>
+    </w:p>
+    <w:p>
       <w:r>
         <w:t xml:space="preserve"/>
       </w:r>
@@ -3692,7 +3972,344 @@
         <w:pStyle w:val="Heading1"/>
       </w:pPr>
       <w:r>
-        <w:t xml:space="preserve">12. 建议后端服务拆包</w:t>
+        <w:t xml:space="preserve">12. 前端工程设计</w:t>
+      </w:r>
+    </w:p>
+    <w:p>
+      <w:r>
+        <w:t xml:space="preserve"/>
+      </w:r>
+    </w:p>
+    <w:p>
+      <w:pPr>
+        <w:pStyle w:val="Heading2"/>
+      </w:pPr>
+      <w:r>
+        <w:t xml:space="preserve">12.1 前端模块结构</w:t>
+      </w:r>
+    </w:p>
+    <w:p>
+      <w:r>
+        <w:t xml:space="preserve"/>
+      </w:r>
+    </w:p>
+    <w:p>
+      <w:pPr>
+        <w:pStyle w:val="Code"/>
+      </w:pPr>
+      <w:r>
+        <w:rPr>
+          <w:rFonts w:ascii="Consolas" w:eastAsia="Microsoft YaHei"/>
+          <w:sz w:val="20"/>
+        </w:rPr>
+        <w:t xml:space="preserve">src/</w:t>
+      </w:r>
+    </w:p>
+    <w:p>
+      <w:pPr>
+        <w:pStyle w:val="Code"/>
+      </w:pPr>
+      <w:r>
+        <w:rPr>
+          <w:rFonts w:ascii="Consolas" w:eastAsia="Microsoft YaHei"/>
+          <w:sz w:val="20"/>
+        </w:rPr>
+        <w:t xml:space="preserve">  app/                    应用入口、路由、全局状态</w:t>
+      </w:r>
+    </w:p>
+    <w:p>
+      <w:pPr>
+        <w:pStyle w:val="Code"/>
+      </w:pPr>
+      <w:r>
+        <w:rPr>
+          <w:rFonts w:ascii="Consolas" w:eastAsia="Microsoft YaHei"/>
+          <w:sz w:val="20"/>
+        </w:rPr>
+        <w:t xml:space="preserve">  layouts/                主布局、侧边栏、顶部栏</w:t>
+      </w:r>
+    </w:p>
+    <w:p>
+      <w:pPr>
+        <w:pStyle w:val="Code"/>
+      </w:pPr>
+      <w:r>
+        <w:rPr>
+          <w:rFonts w:ascii="Consolas" w:eastAsia="Microsoft YaHei"/>
+          <w:sz w:val="20"/>
+        </w:rPr>
+        <w:t xml:space="preserve">  modules/</w:t>
+      </w:r>
+    </w:p>
+    <w:p>
+      <w:pPr>
+        <w:pStyle w:val="Code"/>
+      </w:pPr>
+      <w:r>
+        <w:rPr>
+          <w:rFonts w:ascii="Consolas" w:eastAsia="Microsoft YaHei"/>
+          <w:sz w:val="20"/>
+        </w:rPr>
+        <w:t xml:space="preserve">    data/                 数据源、元数据探查、查询接口、文件解析</w:t>
+      </w:r>
+    </w:p>
+    <w:p>
+      <w:pPr>
+        <w:pStyle w:val="Code"/>
+      </w:pPr>
+      <w:r>
+        <w:rPr>
+          <w:rFonts w:ascii="Consolas" w:eastAsia="Microsoft YaHei"/>
+          <w:sz w:val="20"/>
+        </w:rPr>
+        <w:t xml:space="preserve">    ontology/             建模、草稿、标注、审批</w:t>
+      </w:r>
+    </w:p>
+    <w:p>
+      <w:pPr>
+        <w:pStyle w:val="Code"/>
+      </w:pPr>
+      <w:r>
+        <w:rPr>
+          <w:rFonts w:ascii="Consolas" w:eastAsia="Microsoft YaHei"/>
+          <w:sz w:val="20"/>
+        </w:rPr>
+        <w:t xml:space="preserve">    models/               模型库、模型详情、版本</w:t>
+      </w:r>
+    </w:p>
+    <w:p>
+      <w:pPr>
+        <w:pStyle w:val="Code"/>
+      </w:pPr>
+      <w:r>
+        <w:rPr>
+          <w:rFonts w:ascii="Consolas" w:eastAsia="Microsoft YaHei"/>
+          <w:sz w:val="20"/>
+        </w:rPr>
+        <w:t xml:space="preserve">    visualization/        图谱、树、表格、节点详情</w:t>
+      </w:r>
+    </w:p>
+    <w:p>
+      <w:pPr>
+        <w:pStyle w:val="Code"/>
+      </w:pPr>
+      <w:r>
+        <w:rPr>
+          <w:rFonts w:ascii="Consolas" w:eastAsia="Microsoft YaHei"/>
+          <w:sz w:val="20"/>
+        </w:rPr>
+        <w:t xml:space="preserve">    marketplace/          广场、上传、详情、安装</w:t>
+      </w:r>
+    </w:p>
+    <w:p>
+      <w:pPr>
+        <w:pStyle w:val="Code"/>
+      </w:pPr>
+      <w:r>
+        <w:rPr>
+          <w:rFonts w:ascii="Consolas" w:eastAsia="Microsoft YaHei"/>
+          <w:sz w:val="20"/>
+        </w:rPr>
+        <w:t xml:space="preserve">    app-test/             应用测试问答、证据、反馈、发布</w:t>
+      </w:r>
+    </w:p>
+    <w:p>
+      <w:pPr>
+        <w:pStyle w:val="Code"/>
+      </w:pPr>
+      <w:r>
+        <w:rPr>
+          <w:rFonts w:ascii="Consolas" w:eastAsia="Microsoft YaHei"/>
+          <w:sz w:val="20"/>
+        </w:rPr>
+        <w:t xml:space="preserve">    admin/                用户、角色、SSO、审计</w:t>
+      </w:r>
+    </w:p>
+    <w:p>
+      <w:pPr>
+        <w:pStyle w:val="Code"/>
+      </w:pPr>
+      <w:r>
+        <w:rPr>
+          <w:rFonts w:ascii="Consolas" w:eastAsia="Microsoft YaHei"/>
+          <w:sz w:val="20"/>
+        </w:rPr>
+        <w:t xml:space="preserve">  components/             通用组件</w:t>
+      </w:r>
+    </w:p>
+    <w:p>
+      <w:pPr>
+        <w:pStyle w:val="Code"/>
+      </w:pPr>
+      <w:r>
+        <w:rPr>
+          <w:rFonts w:ascii="Consolas" w:eastAsia="Microsoft YaHei"/>
+          <w:sz w:val="20"/>
+        </w:rPr>
+        <w:t xml:space="preserve">  api/                    API Client 和类型定义</w:t>
+      </w:r>
+    </w:p>
+    <w:p>
+      <w:pPr>
+        <w:pStyle w:val="Code"/>
+      </w:pPr>
+      <w:r>
+        <w:rPr>
+          <w:rFonts w:ascii="Consolas" w:eastAsia="Microsoft YaHei"/>
+          <w:sz w:val="20"/>
+        </w:rPr>
+        <w:t xml:space="preserve">  stores/                 用户、权限、任务、全局配置</w:t>
+      </w:r>
+    </w:p>
+    <w:p>
+      <w:pPr>
+        <w:pStyle w:val="Code"/>
+      </w:pPr>
+      <w:r>
+        <w:rPr>
+          <w:rFonts w:ascii="Consolas" w:eastAsia="Microsoft YaHei"/>
+          <w:sz w:val="20"/>
+        </w:rPr>
+        <w:t xml:space="preserve">  utils/                  格式化、校验、下载、错误处理</w:t>
+      </w:r>
+    </w:p>
+    <w:p>
+      <w:r>
+        <w:t xml:space="preserve"/>
+      </w:r>
+    </w:p>
+    <w:p>
+      <w:pPr>
+        <w:pStyle w:val="Heading2"/>
+      </w:pPr>
+      <w:r>
+        <w:t xml:space="preserve">12.2 前端通用能力</w:t>
+      </w:r>
+    </w:p>
+    <w:p>
+      <w:r>
+        <w:t xml:space="preserve"/>
+      </w:r>
+    </w:p>
+    <w:p>
+      <w:pPr>
+        <w:ind w:left="360" w:hanging="240"/>
+      </w:pPr>
+      <w:r>
+        <w:t xml:space="preserve">• 路由鉴权：未登录跳转、无权限隐藏菜单和按钮。</w:t>
+      </w:r>
+    </w:p>
+    <w:p>
+      <w:pPr>
+        <w:ind w:left="360" w:hanging="240"/>
+      </w:pPr>
+      <w:r>
+        <w:t xml:space="preserve">• API Client：统一请求头、Token 刷新、错误提示、重试策略。</w:t>
+      </w:r>
+    </w:p>
+    <w:p>
+      <w:pPr>
+        <w:ind w:left="360" w:hanging="240"/>
+      </w:pPr>
+      <w:r>
+        <w:t xml:space="preserve">• 任务轮询：元数据探查、文件解析、自动建模、模型发布、推理任务统一轮询组件。</w:t>
+      </w:r>
+    </w:p>
+    <w:p>
+      <w:pPr>
+        <w:ind w:left="360" w:hanging="240"/>
+      </w:pPr>
+      <w:r>
+        <w:t xml:space="preserve">• 文件上传：大文件、批量文件、文件夹导入、失败重试。</w:t>
+      </w:r>
+    </w:p>
+    <w:p>
+      <w:pPr>
+        <w:ind w:left="360" w:hanging="240"/>
+      </w:pPr>
+      <w:r>
+        <w:t xml:space="preserve">• 表格组件：分页、排序、筛选、列配置、批量操作。</w:t>
+      </w:r>
+    </w:p>
+    <w:p>
+      <w:pPr>
+        <w:ind w:left="360" w:hanging="240"/>
+      </w:pPr>
+      <w:r>
+        <w:t xml:space="preserve">• 状态组件：空状态、加载态、错误态、无权限态、任务进行中。</w:t>
+      </w:r>
+    </w:p>
+    <w:p>
+      <w:pPr>
+        <w:ind w:left="360" w:hanging="240"/>
+      </w:pPr>
+      <w:r>
+        <w:t xml:space="preserve">• 证据展示组件：文档片段、表格记录、模型关系、推理路径统一展示。</w:t>
+      </w:r>
+    </w:p>
+    <w:p>
+      <w:pPr>
+        <w:ind w:left="360" w:hanging="240"/>
+      </w:pPr>
+      <w:r>
+        <w:t xml:space="preserve">• 图谱组件：节点懒加载、子图展开、节点筛选、详情面板。</w:t>
+      </w:r>
+    </w:p>
+    <w:p>
+      <w:pPr>
+        <w:ind w:left="360" w:hanging="240"/>
+      </w:pPr>
+      <w:r>
+        <w:t xml:space="preserve">• 表单 schema：数据源配置、技能参数、工具上传、应用配置建议使用 schema 驱动。</w:t>
+      </w:r>
+    </w:p>
+    <w:p>
+      <w:r>
+        <w:t xml:space="preserve"/>
+      </w:r>
+    </w:p>
+    <w:p>
+      <w:pPr>
+        <w:pStyle w:val="Heading2"/>
+      </w:pPr>
+      <w:r>
+        <w:t xml:space="preserve">12.3 前端不直接呈现的后端细节</w:t>
+      </w:r>
+    </w:p>
+    <w:p>
+      <w:r>
+        <w:t xml:space="preserve"/>
+      </w:r>
+    </w:p>
+    <w:p>
+      <w:r>
+        <w:t xml:space="preserve">面向普通用户的 UI 不直接呈现底层存储和查询语言细节，例如 Jena graph URI、SPARQL 语句、查询超时、命名图白名单等。需要调试时可在管理员或开发者模式中展示，普通页面统一表达为“模型查询、推理测试、调用过程、证据来源”。</w:t>
+      </w:r>
+    </w:p>
+    <w:p>
+      <w:r>
+        <w:t xml:space="preserve"/>
+      </w:r>
+    </w:p>
+    <w:p>
+      <w:pPr>
+        <w:pStyle w:val="Heading1"/>
+      </w:pPr>
+      <w:r>
+        <w:t xml:space="preserve">13. 后端工程设计</w:t>
+      </w:r>
+    </w:p>
+    <w:p>
+      <w:r>
+        <w:t xml:space="preserve"/>
+      </w:r>
+    </w:p>
+    <w:p>
+      <w:pPr>
+        <w:pStyle w:val="Heading2"/>
+      </w:pPr>
+      <w:r>
+        <w:t xml:space="preserve">13.1 建议后端服务拆包</w:t>
       </w:r>
     </w:p>
     <w:p>
@@ -3863,10 +4480,219 @@
     </w:p>
     <w:p>
       <w:pPr>
+        <w:pStyle w:val="Heading2"/>
+      </w:pPr>
+      <w:r>
+        <w:t xml:space="preserve">13.2 后端通用能力</w:t>
+      </w:r>
+    </w:p>
+    <w:p>
+      <w:r>
+        <w:t xml:space="preserve"/>
+      </w:r>
+    </w:p>
+    <w:p>
+      <w:pPr>
+        <w:ind w:left="360" w:hanging="240"/>
+      </w:pPr>
+      <w:r>
+        <w:t xml:space="preserve">• 统一鉴权与授权：接口级 RBAC、资源级 ACL、工作空间隔离。</w:t>
+      </w:r>
+    </w:p>
+    <w:p>
+      <w:pPr>
+        <w:ind w:left="360" w:hanging="240"/>
+      </w:pPr>
+      <w:r>
+        <w:t xml:space="preserve">• 统一任务框架：任务创建、排队、执行、进度、日志、取消、重试。</w:t>
+      </w:r>
+    </w:p>
+    <w:p>
+      <w:pPr>
+        <w:ind w:left="360" w:hanging="240"/>
+      </w:pPr>
+      <w:r>
+        <w:t xml:space="preserve">• 统一文件服务：上传、下载、预览、对象存储路径、权限校验。</w:t>
+      </w:r>
+    </w:p>
+    <w:p>
+      <w:pPr>
+        <w:ind w:left="360" w:hanging="240"/>
+      </w:pPr>
+      <w:r>
+        <w:t xml:space="preserve">• 统一审计：记录操作者、资源、动作、请求参数摘要、结果、时间。</w:t>
+      </w:r>
+    </w:p>
+    <w:p>
+      <w:pPr>
+        <w:ind w:left="360" w:hanging="240"/>
+      </w:pPr>
+      <w:r>
+        <w:t xml:space="preserve">• 统一错误码：连接失败、解析失败、权限不足、任务失败、查询超时等。</w:t>
+      </w:r>
+    </w:p>
+    <w:p>
+      <w:pPr>
+        <w:ind w:left="360" w:hanging="240"/>
+      </w:pPr>
+      <w:r>
+        <w:t xml:space="preserve">• 统一配置中心：数据源连接器、解析器、技能执行器、模型发布策略。</w:t>
+      </w:r>
+    </w:p>
+    <w:p>
+      <w:pPr>
+        <w:ind w:left="360" w:hanging="240"/>
+      </w:pPr>
+      <w:r>
+        <w:t xml:space="preserve">• 统一安全策略：凭证加密、字段脱敏、查询只读、工具调用白名单。</w:t>
+      </w:r>
+    </w:p>
+    <w:p>
+      <w:pPr>
+        <w:ind w:left="360" w:hanging="240"/>
+      </w:pPr>
+      <w:r>
+        <w:t xml:space="preserve">• 统一观测：日志、指标、链路追踪、告警。</w:t>
+      </w:r>
+    </w:p>
+    <w:p>
+      <w:r>
+        <w:t xml:space="preserve"/>
+      </w:r>
+    </w:p>
+    <w:p>
+      <w:pPr>
         <w:pStyle w:val="Heading1"/>
       </w:pPr>
       <w:r>
-        <w:t xml:space="preserve">13. 关键数据表建议</w:t>
+        <w:t xml:space="preserve">14. 数据库与存储设计</w:t>
+      </w:r>
+    </w:p>
+    <w:p>
+      <w:r>
+        <w:t xml:space="preserve"/>
+      </w:r>
+    </w:p>
+    <w:p>
+      <w:pPr>
+        <w:pStyle w:val="Heading2"/>
+      </w:pPr>
+      <w:r>
+        <w:t xml:space="preserve">14.1 存储职责划分</w:t>
+      </w:r>
+    </w:p>
+    <w:p>
+      <w:r>
+        <w:t xml:space="preserve"/>
+      </w:r>
+    </w:p>
+    <w:p>
+      <w:pPr>
+        <w:pStyle w:val="Code"/>
+      </w:pPr>
+      <w:r>
+        <w:rPr>
+          <w:rFonts w:ascii="Consolas" w:eastAsia="Microsoft YaHei"/>
+          <w:sz w:val="20"/>
+        </w:rPr>
+        <w:t xml:space="preserve">存储    是否必需    主要职责    不建议承担</w:t>
+      </w:r>
+    </w:p>
+    <w:p>
+      <w:pPr>
+        <w:pStyle w:val="Code"/>
+      </w:pPr>
+      <w:r>
+        <w:rPr>
+          <w:rFonts w:ascii="Consolas" w:eastAsia="Microsoft YaHei"/>
+          <w:sz w:val="20"/>
+        </w:rPr>
+        <w:t xml:space="preserve">PostgreSQL/MySQL    必需    平台业务元数据、用户权限、任务、审批、广场资产、应用配置    大文件、RDF 推理、向量检索</w:t>
+      </w:r>
+    </w:p>
+    <w:p>
+      <w:pPr>
+        <w:pStyle w:val="Code"/>
+      </w:pPr>
+      <w:r>
+        <w:rPr>
+          <w:rFonts w:ascii="Consolas" w:eastAsia="Microsoft YaHei"/>
+          <w:sz w:val="20"/>
+        </w:rPr>
+        <w:t xml:space="preserve">Jena/Fuseki    必需    本体 schema、实例三元组、RDF 查询、推理结果    用户权限、任务状态、业务配置</w:t>
+      </w:r>
+    </w:p>
+    <w:p>
+      <w:pPr>
+        <w:pStyle w:val="Code"/>
+      </w:pPr>
+      <w:r>
+        <w:rPr>
+          <w:rFonts w:ascii="Consolas" w:eastAsia="Microsoft YaHei"/>
+          <w:sz w:val="20"/>
+        </w:rPr>
+        <w:t xml:space="preserve">对象存储    必需    原始文件、解析产物、导出文件、上传包    结构化查询、权限主数据</w:t>
+      </w:r>
+    </w:p>
+    <w:p>
+      <w:pPr>
+        <w:pStyle w:val="Code"/>
+      </w:pPr>
+      <w:r>
+        <w:rPr>
+          <w:rFonts w:ascii="Consolas" w:eastAsia="Microsoft YaHei"/>
+          <w:sz w:val="20"/>
+        </w:rPr>
+        <w:t xml:space="preserve">OpenSearch/Elasticsearch    建议    全文检索、文档证据召回、广场搜索    强事务数据</w:t>
+      </w:r>
+    </w:p>
+    <w:p>
+      <w:pPr>
+        <w:pStyle w:val="Code"/>
+      </w:pPr>
+      <w:r>
+        <w:rPr>
+          <w:rFonts w:ascii="Consolas" w:eastAsia="Microsoft YaHei"/>
+          <w:sz w:val="20"/>
+        </w:rPr>
+        <w:t xml:space="preserve">向量库    建议    语义检索、RAG 召回、概念相似度    权限、审批、强一致配置</w:t>
+      </w:r>
+    </w:p>
+    <w:p>
+      <w:pPr>
+        <w:pStyle w:val="Code"/>
+      </w:pPr>
+      <w:r>
+        <w:rPr>
+          <w:rFonts w:ascii="Consolas" w:eastAsia="Microsoft YaHei"/>
+          <w:sz w:val="20"/>
+        </w:rPr>
+        <w:t xml:space="preserve">Redis    建议    缓存、会话、任务进度、限流    持久业务主数据</w:t>
+      </w:r>
+    </w:p>
+    <w:p>
+      <w:pPr>
+        <w:pStyle w:val="Code"/>
+      </w:pPr>
+      <w:r>
+        <w:rPr>
+          <w:rFonts w:ascii="Consolas" w:eastAsia="Microsoft YaHei"/>
+          <w:sz w:val="20"/>
+        </w:rPr>
+        <w:t xml:space="preserve">消息队列    建议    异步任务、削峰、事件分发    业务最终存储</w:t>
+      </w:r>
+    </w:p>
+    <w:p>
+      <w:r>
+        <w:t xml:space="preserve"/>
+      </w:r>
+    </w:p>
+    <w:p>
+      <w:pPr>
+        <w:pStyle w:val="Heading2"/>
+      </w:pPr>
+      <w:r>
+        <w:t xml:space="preserve">14.2 关系型数据库表建议</w:t>
       </w:r>
     </w:p>
     <w:p>
@@ -4196,7 +5022,7 @@
         <w:pStyle w:val="Heading1"/>
       </w:pPr>
       <w:r>
-        <w:t xml:space="preserve">14. 权限设计</w:t>
+        <w:t xml:space="preserve">15. 权限设计</w:t>
       </w:r>
     </w:p>
     <w:p>
@@ -4310,7 +5136,7 @@
         <w:pStyle w:val="Heading1"/>
       </w:pPr>
       <w:r>
-        <w:t xml:space="preserve">15. 非功能要求</w:t>
+        <w:t xml:space="preserve">16. 非功能要求</w:t>
       </w:r>
     </w:p>
     <w:p>
@@ -4384,7 +5210,7 @@
         <w:pStyle w:val="Heading1"/>
       </w:pPr>
       <w:r>
-        <w:t xml:space="preserve">16. MVP 研发范围</w:t>
+        <w:t xml:space="preserve">17. 部署、运维与测试策略</w:t>
       </w:r>
     </w:p>
     <w:p>
@@ -4397,6 +5223,201 @@
         <w:pStyle w:val="Heading2"/>
       </w:pPr>
       <w:r>
+        <w:t xml:space="preserve">17.1 部署建议</w:t>
+      </w:r>
+    </w:p>
+    <w:p>
+      <w:r>
+        <w:t xml:space="preserve"/>
+      </w:r>
+    </w:p>
+    <w:p>
+      <w:pPr>
+        <w:ind w:left="360" w:hanging="240"/>
+      </w:pPr>
+      <w:r>
+        <w:t xml:space="preserve">• 开发环境：前端开发服务、后端服务、PostgreSQL/MySQL、Jena、Redis、对象存储、OpenSearch/Elasticsearch、向量库可使用 Docker Compose 启动。</w:t>
+      </w:r>
+    </w:p>
+    <w:p>
+      <w:pPr>
+        <w:ind w:left="360" w:hanging="240"/>
+      </w:pPr>
+      <w:r>
+        <w:t xml:space="preserve">• 测试环境：与生产接近，必须包含任务队列、对象存储、Jena、检索库和向量库。</w:t>
+      </w:r>
+    </w:p>
+    <w:p>
+      <w:pPr>
+        <w:ind w:left="360" w:hanging="240"/>
+      </w:pPr>
+      <w:r>
+        <w:t xml:space="preserve">• 生产环境：建议容器化部署，支持水平扩展；解析、建模、推理等 worker 与 API 服务分离。</w:t>
+      </w:r>
+    </w:p>
+    <w:p>
+      <w:pPr>
+        <w:ind w:left="360" w:hanging="240"/>
+      </w:pPr>
+      <w:r>
+        <w:t xml:space="preserve">• 配置管理：数据库密码、SSO 密钥、模型服务密钥和第三方 API Key 不进入代码仓库，使用密钥系统或环境变量注入。</w:t>
+      </w:r>
+    </w:p>
+    <w:p>
+      <w:pPr>
+        <w:ind w:left="360" w:hanging="240"/>
+      </w:pPr>
+      <w:r>
+        <w:t xml:space="preserve">• 数据备份：业务关系库、Jena 数据集、对象存储、检索索引、向量索引分别制定备份和恢复策略。</w:t>
+      </w:r>
+    </w:p>
+    <w:p>
+      <w:r>
+        <w:t xml:space="preserve"/>
+      </w:r>
+    </w:p>
+    <w:p>
+      <w:pPr>
+        <w:pStyle w:val="Heading2"/>
+      </w:pPr>
+      <w:r>
+        <w:t xml:space="preserve">17.2 测试策略</w:t>
+      </w:r>
+    </w:p>
+    <w:p>
+      <w:r>
+        <w:t xml:space="preserve"/>
+      </w:r>
+    </w:p>
+    <w:p>
+      <w:pPr>
+        <w:ind w:left="360" w:hanging="240"/>
+      </w:pPr>
+      <w:r>
+        <w:t xml:space="preserve">• 前端单元测试：表单校验、权限显示、任务状态组件、证据组件。</w:t>
+      </w:r>
+    </w:p>
+    <w:p>
+      <w:pPr>
+        <w:ind w:left="360" w:hanging="240"/>
+      </w:pPr>
+      <w:r>
+        <w:t xml:space="preserve">• 前端端到端测试：数据接入、自动建模、审批发布、应用测试、广场发布主流程。</w:t>
+      </w:r>
+    </w:p>
+    <w:p>
+      <w:pPr>
+        <w:ind w:left="360" w:hanging="240"/>
+      </w:pPr>
+      <w:r>
+        <w:t xml:space="preserve">• 后端单元测试：连接器、查询接口生成、解析器、草稿校验、权限判断。</w:t>
+      </w:r>
+    </w:p>
+    <w:p>
+      <w:pPr>
+        <w:ind w:left="360" w:hanging="240"/>
+      </w:pPr>
+      <w:r>
+        <w:t xml:space="preserve">• 后端集成测试：数据库连接、Jena 查询推理、对象存储、队列任务、检索库、向量库。</w:t>
+      </w:r>
+    </w:p>
+    <w:p>
+      <w:pPr>
+        <w:ind w:left="360" w:hanging="240"/>
+      </w:pPr>
+      <w:r>
+        <w:t xml:space="preserve">• 回归测试数据集：准备固定文档和数据库样例，用于验证解析结果、自动建模结果和问答证据。</w:t>
+      </w:r>
+    </w:p>
+    <w:p>
+      <w:pPr>
+        <w:ind w:left="360" w:hanging="240"/>
+      </w:pPr>
+      <w:r>
+        <w:t xml:space="preserve">• 性能测试：数据查询接口、图谱子图查询、Jena 查询、向量检索、问答编排链路。</w:t>
+      </w:r>
+    </w:p>
+    <w:p>
+      <w:r>
+        <w:t xml:space="preserve"/>
+      </w:r>
+    </w:p>
+    <w:p>
+      <w:pPr>
+        <w:pStyle w:val="Heading2"/>
+      </w:pPr>
+      <w:r>
+        <w:t xml:space="preserve">17.3 API 与契约管理</w:t>
+      </w:r>
+    </w:p>
+    <w:p>
+      <w:r>
+        <w:t xml:space="preserve"/>
+      </w:r>
+    </w:p>
+    <w:p>
+      <w:pPr>
+        <w:ind w:left="360" w:hanging="240"/>
+      </w:pPr>
+      <w:r>
+        <w:t xml:space="preserve">• 使用 OpenAPI 维护接口契约。</w:t>
+      </w:r>
+    </w:p>
+    <w:p>
+      <w:pPr>
+        <w:ind w:left="360" w:hanging="240"/>
+      </w:pPr>
+      <w:r>
+        <w:t xml:space="preserve">• 前端基于 OpenAPI 生成 TypeScript 类型或 API Client。</w:t>
+      </w:r>
+    </w:p>
+    <w:p>
+      <w:pPr>
+        <w:ind w:left="360" w:hanging="240"/>
+      </w:pPr>
+      <w:r>
+        <w:t xml:space="preserve">• 后端接口变更需保持版本兼容，破坏性变更需要新增版本。</w:t>
+      </w:r>
+    </w:p>
+    <w:p>
+      <w:pPr>
+        <w:ind w:left="360" w:hanging="240"/>
+      </w:pPr>
+      <w:r>
+        <w:t xml:space="preserve">• 异步任务统一状态枚举：PENDING、RUNNING、SUCCESS、FAILED、CANCELLED。</w:t>
+      </w:r>
+    </w:p>
+    <w:p>
+      <w:pPr>
+        <w:ind w:left="360" w:hanging="240"/>
+      </w:pPr>
+      <w:r>
+        <w:t xml:space="preserve">• 错误码统一维护，避免前端通过错误文本判断逻辑。</w:t>
+      </w:r>
+    </w:p>
+    <w:p>
+      <w:r>
+        <w:t xml:space="preserve"/>
+      </w:r>
+    </w:p>
+    <w:p>
+      <w:pPr>
+        <w:pStyle w:val="Heading1"/>
+      </w:pPr>
+      <w:r>
+        <w:t xml:space="preserve">18. MVP 研发范围</w:t>
+      </w:r>
+    </w:p>
+    <w:p>
+      <w:r>
+        <w:t xml:space="preserve"/>
+      </w:r>
+    </w:p>
+    <w:p>
+      <w:pPr>
+        <w:pStyle w:val="Heading2"/>
+      </w:pPr>
+      <w:r>
         <w:t xml:space="preserve">第一阶段：数据与模型闭环</w:t>
       </w:r>
     </w:p>
@@ -4637,7 +5658,7 @@
         <w:pStyle w:val="Heading1"/>
       </w:pPr>
       <w:r>
-        <w:t xml:space="preserve">17. 交付验收清单</w:t>
+        <w:t xml:space="preserve">19. 交付验收清单</w:t>
       </w:r>
     </w:p>
     <w:p>
@@ -4723,6 +5744,167 @@
       </w:pPr>
       <w:r>
         <w:t xml:space="preserve">• 问答应用、智能体、工具、技能和模型可发布或引用到广场。</w:t>
+      </w:r>
+    </w:p>
+    <w:p>
+      <w:r>
+        <w:t xml:space="preserve"/>
+      </w:r>
+    </w:p>
+    <w:p>
+      <w:pPr>
+        <w:pStyle w:val="Heading1"/>
+      </w:pPr>
+      <w:r>
+        <w:t xml:space="preserve">20. AI 编码 Token 规模估算</w:t>
+      </w:r>
+    </w:p>
+    <w:p>
+      <w:r>
+        <w:t xml:space="preserve"/>
+      </w:r>
+    </w:p>
+    <w:p>
+      <w:r>
+        <w:t xml:space="preserve">如果由 AI 编码代理从当前原型和架构文档继续开发完整平台，token 消耗取决于是否已有工程脚手架、技术栈、第三方服务、测试数据和部署环境。以下估算按“输入 + 输出 + 工具调用上下文”的总 token 粗略计算，不等同于人力工时。</w:t>
+      </w:r>
+    </w:p>
+    <w:p>
+      <w:r>
+        <w:t xml:space="preserve"/>
+      </w:r>
+    </w:p>
+    <w:p>
+      <w:pPr>
+        <w:pStyle w:val="Code"/>
+      </w:pPr>
+      <w:r>
+        <w:rPr>
+          <w:rFonts w:ascii="Consolas" w:eastAsia="Microsoft YaHei"/>
+          <w:sz w:val="20"/>
+        </w:rPr>
+        <w:t xml:space="preserve">范围    主要内容    预估 token</w:t>
+      </w:r>
+    </w:p>
+    <w:p>
+      <w:pPr>
+        <w:pStyle w:val="Code"/>
+      </w:pPr>
+      <w:r>
+        <w:rPr>
+          <w:rFonts w:ascii="Consolas" w:eastAsia="Microsoft YaHei"/>
+          <w:sz w:val="20"/>
+        </w:rPr>
+        <w:t xml:space="preserve">原型增强与架构文档    UI 原型、架构文档、接口草案、数据模型草案    10 万 - 30 万</w:t>
+      </w:r>
+    </w:p>
+    <w:p>
+      <w:pPr>
+        <w:pStyle w:val="Code"/>
+      </w:pPr>
+      <w:r>
+        <w:rPr>
+          <w:rFonts w:ascii="Consolas" w:eastAsia="Microsoft YaHei"/>
+          <w:sz w:val="20"/>
+        </w:rPr>
+        <w:t xml:space="preserve">MVP 可运行版本    登录权限、数据接入、文件解析、自动建模草稿、标注审批、模型库、Jena 发布、基础应用测试    200 万 - 400 万</w:t>
+      </w:r>
+    </w:p>
+    <w:p>
+      <w:pPr>
+        <w:pStyle w:val="Code"/>
+      </w:pPr>
+      <w:r>
+        <w:rPr>
+          <w:rFonts w:ascii="Consolas" w:eastAsia="Microsoft YaHei"/>
+          <w:sz w:val="20"/>
+        </w:rPr>
+        <w:t xml:space="preserve">较完整产品版本    多数据源连接器、解析任务体系、Jena 查询推理、技能系统、广场、问答应用分享、审计、部署脚本和完整测试    800 万 - 1500 万</w:t>
+      </w:r>
+    </w:p>
+    <w:p>
+      <w:pPr>
+        <w:pStyle w:val="Code"/>
+      </w:pPr>
+      <w:r>
+        <w:rPr>
+          <w:rFonts w:ascii="Consolas" w:eastAsia="Microsoft YaHei"/>
+          <w:sz w:val="20"/>
+        </w:rPr>
+        <w:t xml:space="preserve">生产级增强版本    多租户、权限细粒度、稳定任务队列、监控告警、插件安全、性能优化、更多连接器和解析器、CI/CD、完整回归测试    1500 万 - 3000 万</w:t>
+      </w:r>
+    </w:p>
+    <w:p>
+      <w:r>
+        <w:t xml:space="preserve"/>
+      </w:r>
+    </w:p>
+    <w:p>
+      <w:r>
+        <w:t xml:space="preserve">更准确的估算需要先确定：</w:t>
+      </w:r>
+    </w:p>
+    <w:p>
+      <w:r>
+        <w:t xml:space="preserve"/>
+      </w:r>
+    </w:p>
+    <w:p>
+      <w:pPr>
+        <w:ind w:left="360" w:hanging="240"/>
+      </w:pPr>
+      <w:r>
+        <w:t xml:space="preserve">• 前端技术栈：React、Vue 或其他。</w:t>
+      </w:r>
+    </w:p>
+    <w:p>
+      <w:pPr>
+        <w:ind w:left="360" w:hanging="240"/>
+      </w:pPr>
+      <w:r>
+        <w:t xml:space="preserve">• 后端技术栈：Java/Spring、Python/FastAPI、Node.js 等。</w:t>
+      </w:r>
+    </w:p>
+    <w:p>
+      <w:pPr>
+        <w:ind w:left="360" w:hanging="240"/>
+      </w:pPr>
+      <w:r>
+        <w:t xml:space="preserve">• 是否已有统一登录、权限、任务队列、文件服务、对象存储。</w:t>
+      </w:r>
+    </w:p>
+    <w:p>
+      <w:pPr>
+        <w:ind w:left="360" w:hanging="240"/>
+      </w:pPr>
+      <w:r>
+        <w:t xml:space="preserve">• 是否需要内置大模型调用、向量检索、OCR、文档解析商业组件。</w:t>
+      </w:r>
+    </w:p>
+    <w:p>
+      <w:pPr>
+        <w:ind w:left="360" w:hanging="240"/>
+      </w:pPr>
+      <w:r>
+        <w:t xml:space="preserve">• Jena 部署方式、数据规模、推理复杂度。</w:t>
+      </w:r>
+    </w:p>
+    <w:p>
+      <w:pPr>
+        <w:ind w:left="360" w:hanging="240"/>
+      </w:pPr>
+      <w:r>
+        <w:t xml:space="preserve">• 是否要求生产级安全、监控、部署和自动化测试。</w:t>
+      </w:r>
+    </w:p>
+    <w:p>
+      <w:r>
+        <w:t xml:space="preserve"/>
+      </w:r>
+    </w:p>
+    <w:p>
+      <w:r>
+        <w:t xml:space="preserve">如果从零开发一个“可演示但链路完整”的 MVP，我会按 200 万 - 400 万 token 预留；如果要达到可给企业用户试用的完整平台，建议按 800 万 token 以上预留。</w:t>
       </w:r>
     </w:p>
     <w:sectPr>

</xml_diff>